<commit_message>
Fase 1 - atualizando aba de algoritmos
</commit_message>
<xml_diff>
--- a/docs/Resumo Expandido SAPCT CIMATEC 2026 - TSP Quantum Annealing.docx
+++ b/docs/Resumo Expandido SAPCT CIMATEC 2026 - TSP Quantum Annealing.docx
@@ -118,15 +118,7 @@
           <w:sz w:val="20"/>
           <w:szCs w:val="20"/>
         </w:rPr>
-        <w:t xml:space="preserve">; </w:t>
-      </w:r>
-      <w:r>
-        <w:rPr>
-          <w:rFonts w:ascii="Arial" w:eastAsia="Arial" w:hAnsi="Arial" w:cs="Arial"/>
-          <w:sz w:val="20"/>
-          <w:szCs w:val="20"/>
-        </w:rPr>
-        <w:t>Valéria Loureiro da Silva</w:t>
+        <w:t>; Valéria Loureiro da Silva</w:t>
       </w:r>
       <w:r>
         <w:rPr>
@@ -284,135 +276,73 @@
           <w:sz w:val="18"/>
           <w:szCs w:val="18"/>
         </w:rPr>
-        <w:t xml:space="preserve">O Problema do Caixeiro Viajante (TSP) é um dos problemas de otimização combinatória mais relevantes para a logística, sendo classificado como NP-difícil. A computação quântica, particularmente o Quantum </w:t>
-      </w:r>
-      <w:proofErr w:type="spellStart"/>
-      <w:r>
-        <w:rPr>
-          <w:rFonts w:ascii="Arial" w:eastAsia="Arial" w:hAnsi="Arial" w:cs="Arial"/>
+        <w:t xml:space="preserve">O Problema do Caixeiro Viajante (TSP) é um dos problemas de otimização combinatória mais relevantes para a logística, sendo classificado como </w:t>
+      </w:r>
+      <w:r>
+        <w:rPr>
+          <w:rFonts w:ascii="Arial" w:eastAsia="Arial" w:hAnsi="Arial" w:cs="Arial"/>
+          <w:i/>
+          <w:iCs/>
           <w:sz w:val="18"/>
           <w:szCs w:val="18"/>
         </w:rPr>
-        <w:t>Annealing</w:t>
-      </w:r>
-      <w:proofErr w:type="spellEnd"/>
-      <w:r>
-        <w:rPr>
-          <w:rFonts w:ascii="Arial" w:eastAsia="Arial" w:hAnsi="Arial" w:cs="Arial"/>
+        <w:t>NP-</w:t>
+      </w:r>
+      <w:r>
+        <w:rPr>
+          <w:rFonts w:ascii="Arial" w:eastAsia="Arial" w:hAnsi="Arial" w:cs="Arial"/>
+          <w:i/>
+          <w:iCs/>
           <w:sz w:val="18"/>
           <w:szCs w:val="18"/>
         </w:rPr>
-        <w:t xml:space="preserve"> (QA), tem se destacado como abordagem promissora para enfrentar a complexidade computacional deste tipo de problema. Este trabalho apresenta uma revisão exploratória da literatura sobre a aplicação de algoritmos quânticos ao TSP e suas variantes em contextos logísticos. Foram executadas 26 </w:t>
-      </w:r>
-      <w:proofErr w:type="spellStart"/>
+        <w:t>Hard</w:t>
+      </w:r>
       <w:r>
         <w:rPr>
           <w:rFonts w:ascii="Arial" w:eastAsia="Arial" w:hAnsi="Arial" w:cs="Arial"/>
           <w:sz w:val="18"/>
           <w:szCs w:val="18"/>
         </w:rPr>
-        <w:t>strings</w:t>
-      </w:r>
-      <w:proofErr w:type="spellEnd"/>
-      <w:r>
+        <w:t>. A computação quântica, particularmente o Quantum Annealing (QA), tem se destacado como abordagem promissora para enfrentar a complexidade computacional deste tipo de problema. Este trabalho apresenta uma revisão exploratória da literatura sobre a aplicação de algoritmos quânticos ao TSP e suas variantes em contextos logísticos. Foram executadas 26 strings de busca na base Lens.org, resultando em 3.696 artigos únicos após deduplicação. Os resultados indicam que o QA é o paradigma dominante, com destaque para a plataforma D-Wave. Identificaram-se lacunas significativas em abordagens gate-based e em aplicações de aprendizado de máquina quântico para roteamento logístico, apontando direções promissoras para pesquisas futuras.</w:t>
+      </w:r>
+    </w:p>
+    <w:p>
+      <w:pPr>
+        <w:spacing w:after="0" w:line="240" w:lineRule="auto"/>
+        <w:jc w:val="both"/>
+        <w:rPr>
+          <w:rFonts w:ascii="Arial" w:eastAsia="Arial" w:hAnsi="Arial" w:cs="Arial"/>
+        </w:rPr>
+      </w:pPr>
+    </w:p>
+    <w:p>
+      <w:pPr>
+        <w:spacing w:after="0" w:line="240" w:lineRule="auto"/>
+        <w:jc w:val="both"/>
         <w:rPr>
           <w:rFonts w:ascii="Arial" w:eastAsia="Arial" w:hAnsi="Arial" w:cs="Arial"/>
           <w:sz w:val="18"/>
           <w:szCs w:val="18"/>
         </w:rPr>
-        <w:t xml:space="preserve"> de busca na base Lens.org, resultando em 3.696 artigos únicos após </w:t>
-      </w:r>
-      <w:proofErr w:type="spellStart"/>
-      <w:r>
-        <w:rPr>
-          <w:rFonts w:ascii="Arial" w:eastAsia="Arial" w:hAnsi="Arial" w:cs="Arial"/>
+      </w:pPr>
+      <w:r>
+        <w:rPr>
+          <w:rFonts w:ascii="Arial" w:eastAsia="Arial" w:hAnsi="Arial" w:cs="Arial"/>
+          <w:b/>
+          <w:bCs/>
           <w:sz w:val="18"/>
           <w:szCs w:val="18"/>
         </w:rPr>
-        <w:t>deduplicação</w:t>
-      </w:r>
-      <w:proofErr w:type="spellEnd"/>
+        <w:t>PALAVRAS-CHAVE:</w:t>
+      </w:r>
       <w:r>
         <w:rPr>
           <w:rFonts w:ascii="Arial" w:eastAsia="Arial" w:hAnsi="Arial" w:cs="Arial"/>
           <w:sz w:val="18"/>
           <w:szCs w:val="18"/>
         </w:rPr>
-        <w:t>. Os resultados indicam que o QA é o paradigma dominante, com destaque para a plataforma D-</w:t>
-      </w:r>
-      <w:proofErr w:type="spellStart"/>
-      <w:r>
-        <w:rPr>
-          <w:rFonts w:ascii="Arial" w:eastAsia="Arial" w:hAnsi="Arial" w:cs="Arial"/>
-          <w:sz w:val="18"/>
-          <w:szCs w:val="18"/>
-        </w:rPr>
-        <w:t>Wave</w:t>
-      </w:r>
-      <w:proofErr w:type="spellEnd"/>
-      <w:r>
-        <w:rPr>
-          <w:rFonts w:ascii="Arial" w:eastAsia="Arial" w:hAnsi="Arial" w:cs="Arial"/>
-          <w:sz w:val="18"/>
-          <w:szCs w:val="18"/>
-        </w:rPr>
-        <w:t>. Identificaram-se lacunas significativas em abordagens gate-based e em aplicações de aprendizado de máquina quântico para roteamento logístico, apontando direções promissoras para pesquisas futuras.</w:t>
-      </w:r>
-    </w:p>
-    <w:p>
-      <w:pPr>
-        <w:spacing w:after="0" w:line="240" w:lineRule="auto"/>
-        <w:jc w:val="both"/>
-        <w:rPr>
-          <w:rFonts w:ascii="Arial" w:eastAsia="Arial" w:hAnsi="Arial" w:cs="Arial"/>
-        </w:rPr>
-      </w:pPr>
-    </w:p>
-    <w:p>
-      <w:pPr>
-        <w:spacing w:after="0" w:line="240" w:lineRule="auto"/>
-        <w:jc w:val="both"/>
-        <w:rPr>
-          <w:rFonts w:ascii="Arial" w:eastAsia="Arial" w:hAnsi="Arial" w:cs="Arial"/>
-          <w:sz w:val="18"/>
-          <w:szCs w:val="18"/>
-        </w:rPr>
-      </w:pPr>
-      <w:r>
-        <w:rPr>
-          <w:rFonts w:ascii="Arial" w:eastAsia="Arial" w:hAnsi="Arial" w:cs="Arial"/>
-          <w:b/>
-          <w:bCs/>
-          <w:sz w:val="18"/>
-          <w:szCs w:val="18"/>
-        </w:rPr>
-        <w:t>PALAVRAS-CHAVE:</w:t>
-      </w:r>
-      <w:r>
-        <w:rPr>
-          <w:rFonts w:ascii="Arial" w:eastAsia="Arial" w:hAnsi="Arial" w:cs="Arial"/>
-          <w:sz w:val="18"/>
-          <w:szCs w:val="18"/>
-        </w:rPr>
-        <w:t xml:space="preserve"> Problema do Caixeiro Viajante; Quantum </w:t>
-      </w:r>
-      <w:proofErr w:type="spellStart"/>
-      <w:r>
-        <w:rPr>
-          <w:rFonts w:ascii="Arial" w:eastAsia="Arial" w:hAnsi="Arial" w:cs="Arial"/>
-          <w:sz w:val="18"/>
-          <w:szCs w:val="18"/>
-        </w:rPr>
-        <w:t>Annealing</w:t>
-      </w:r>
-      <w:proofErr w:type="spellEnd"/>
-      <w:r>
-        <w:rPr>
-          <w:rFonts w:ascii="Arial" w:eastAsia="Arial" w:hAnsi="Arial" w:cs="Arial"/>
-          <w:sz w:val="18"/>
-          <w:szCs w:val="18"/>
-        </w:rPr>
-        <w:t>; Otimização Combinatória; Logística.</w:t>
+        <w:t xml:space="preserve"> Problema do Caixeiro Viajante; Quantum Annealing; Otimização Combinatória; Logística.</w:t>
       </w:r>
     </w:p>
     <w:p>
@@ -473,7 +403,23 @@
           <w:szCs w:val="20"/>
         </w:rPr>
         <w:tab/>
-        <w:t>O Problema do Caixeiro Viajante (TSP) consiste em determinar a rota de menor custo que visite um conjunto de cidades exatamente uma vez e retorne à origem. Classificado como NP-difícil, o TSP possui grande relevância prática, especialmente na logística, onde a otimização de rotas de entrega impacta diretamente custos operacionais e eficiência.</w:t>
+        <w:t>O Problema do Caixeiro Viajante (TSP) consiste em determinar a rota de menor custo que visite um conjunto de cidades exatamente uma vez e retorne à origem. Classificado como NP-</w:t>
+      </w:r>
+      <w:r>
+        <w:rPr>
+          <w:rFonts w:ascii="Arial" w:eastAsia="Arial" w:hAnsi="Arial" w:cs="Arial"/>
+          <w:sz w:val="20"/>
+          <w:szCs w:val="20"/>
+        </w:rPr>
+        <w:t>Hard</w:t>
+      </w:r>
+      <w:r>
+        <w:rPr>
+          <w:rFonts w:ascii="Arial" w:eastAsia="Arial" w:hAnsi="Arial" w:cs="Arial"/>
+          <w:sz w:val="20"/>
+          <w:szCs w:val="20"/>
+        </w:rPr>
+        <w:t>, o TSP possui grande relevância prática, especialmente na logística, onde a otimização de rotas de entrega impacta diretamente custos operacionais e eficiência.</w:t>
       </w:r>
       <w:r>
         <w:rPr>
@@ -510,97 +456,7 @@
           <w:szCs w:val="20"/>
         </w:rPr>
         <w:tab/>
-        <w:t xml:space="preserve">A computação quântica surge como alternativa para explorar o espaço de soluções de problemas combinatórios de forma mais eficiente que métodos clássicos. O Quantum </w:t>
-      </w:r>
-      <w:proofErr w:type="spellStart"/>
-      <w:r>
-        <w:rPr>
-          <w:rFonts w:ascii="Arial" w:eastAsia="Arial" w:hAnsi="Arial" w:cs="Arial"/>
-          <w:sz w:val="20"/>
-          <w:szCs w:val="20"/>
-        </w:rPr>
-        <w:t>Annealing</w:t>
-      </w:r>
-      <w:proofErr w:type="spellEnd"/>
-      <w:r>
-        <w:rPr>
-          <w:rFonts w:ascii="Arial" w:eastAsia="Arial" w:hAnsi="Arial" w:cs="Arial"/>
-          <w:sz w:val="20"/>
-          <w:szCs w:val="20"/>
-        </w:rPr>
-        <w:t xml:space="preserve"> (QA) utiliza o tunelamento quântico para buscar o estado de menor energia de um sistema formulado como QUBO (</w:t>
-      </w:r>
-      <w:proofErr w:type="spellStart"/>
-      <w:r>
-        <w:rPr>
-          <w:rFonts w:ascii="Arial" w:eastAsia="Arial" w:hAnsi="Arial" w:cs="Arial"/>
-          <w:sz w:val="20"/>
-          <w:szCs w:val="20"/>
-        </w:rPr>
-        <w:t>Quadratic</w:t>
-      </w:r>
-      <w:proofErr w:type="spellEnd"/>
-      <w:r>
-        <w:rPr>
-          <w:rFonts w:ascii="Arial" w:eastAsia="Arial" w:hAnsi="Arial" w:cs="Arial"/>
-          <w:sz w:val="20"/>
-          <w:szCs w:val="20"/>
-        </w:rPr>
-        <w:t xml:space="preserve"> </w:t>
-      </w:r>
-      <w:proofErr w:type="spellStart"/>
-      <w:r>
-        <w:rPr>
-          <w:rFonts w:ascii="Arial" w:eastAsia="Arial" w:hAnsi="Arial" w:cs="Arial"/>
-          <w:sz w:val="20"/>
-          <w:szCs w:val="20"/>
-        </w:rPr>
-        <w:t>Unconstrained</w:t>
-      </w:r>
-      <w:proofErr w:type="spellEnd"/>
-      <w:r>
-        <w:rPr>
-          <w:rFonts w:ascii="Arial" w:eastAsia="Arial" w:hAnsi="Arial" w:cs="Arial"/>
-          <w:sz w:val="20"/>
-          <w:szCs w:val="20"/>
-        </w:rPr>
-        <w:t xml:space="preserve"> </w:t>
-      </w:r>
-      <w:proofErr w:type="spellStart"/>
-      <w:r>
-        <w:rPr>
-          <w:rFonts w:ascii="Arial" w:eastAsia="Arial" w:hAnsi="Arial" w:cs="Arial"/>
-          <w:sz w:val="20"/>
-          <w:szCs w:val="20"/>
-        </w:rPr>
-        <w:t>Binary</w:t>
-      </w:r>
-      <w:proofErr w:type="spellEnd"/>
-      <w:r>
-        <w:rPr>
-          <w:rFonts w:ascii="Arial" w:eastAsia="Arial" w:hAnsi="Arial" w:cs="Arial"/>
-          <w:sz w:val="20"/>
-          <w:szCs w:val="20"/>
-        </w:rPr>
-        <w:t xml:space="preserve"> </w:t>
-      </w:r>
-      <w:proofErr w:type="spellStart"/>
-      <w:r>
-        <w:rPr>
-          <w:rFonts w:ascii="Arial" w:eastAsia="Arial" w:hAnsi="Arial" w:cs="Arial"/>
-          <w:sz w:val="20"/>
-          <w:szCs w:val="20"/>
-        </w:rPr>
-        <w:t>Optimization</w:t>
-      </w:r>
-      <w:proofErr w:type="spellEnd"/>
-      <w:r>
-        <w:rPr>
-          <w:rFonts w:ascii="Arial" w:eastAsia="Arial" w:hAnsi="Arial" w:cs="Arial"/>
-          <w:sz w:val="20"/>
-          <w:szCs w:val="20"/>
-        </w:rPr>
-        <w:t>), sendo implementado em hardware dedicado como os processadores D-Wave.</w:t>
+        <w:t>A computação quântica surge como alternativa para explorar o espaço de soluções de problemas combinatórios de forma mais eficiente que métodos clássicos. O Quantum Annealing (QA) utiliza o tunelamento quântico para buscar o estado de menor energia de um sistema formulado como QUBO (Quadratic Unconstrained Binary Optimization), sendo implementado em hardware dedicado como os processadores D-Wave.</w:t>
       </w:r>
       <w:r>
         <w:rPr>
@@ -617,43 +473,7 @@
           <w:sz w:val="20"/>
           <w:szCs w:val="20"/>
         </w:rPr>
-        <w:t xml:space="preserve"> </w:t>
-      </w:r>
-      <w:proofErr w:type="spellStart"/>
-      <w:r>
-        <w:rPr>
-          <w:rFonts w:ascii="Arial" w:eastAsia="Arial" w:hAnsi="Arial" w:cs="Arial"/>
-          <w:sz w:val="20"/>
-          <w:szCs w:val="20"/>
-        </w:rPr>
-        <w:t>Salehi</w:t>
-      </w:r>
-      <w:proofErr w:type="spellEnd"/>
-      <w:r>
-        <w:rPr>
-          <w:rFonts w:ascii="Arial" w:eastAsia="Arial" w:hAnsi="Arial" w:cs="Arial"/>
-          <w:sz w:val="20"/>
-          <w:szCs w:val="20"/>
-        </w:rPr>
-        <w:t xml:space="preserve">, Glos e </w:t>
-      </w:r>
-      <w:proofErr w:type="spellStart"/>
-      <w:r>
-        <w:rPr>
-          <w:rFonts w:ascii="Arial" w:eastAsia="Arial" w:hAnsi="Arial" w:cs="Arial"/>
-          <w:sz w:val="20"/>
-          <w:szCs w:val="20"/>
-        </w:rPr>
-        <w:t>Miszczak</w:t>
-      </w:r>
-      <w:proofErr w:type="spellEnd"/>
-      <w:r>
-        <w:rPr>
-          <w:rFonts w:ascii="Arial" w:eastAsia="Arial" w:hAnsi="Arial" w:cs="Arial"/>
-          <w:sz w:val="20"/>
-          <w:szCs w:val="20"/>
-        </w:rPr>
-        <w:t xml:space="preserve"> (2022) propuseram três formulações QUBO para o TSPTW, demonstrando a viabilidade de codificar variantes realistas do problema em dispositivos de quantum annealing.</w:t>
+        <w:t xml:space="preserve"> Salehi, Glos e Miszczak (2022) propuseram três formulações QUBO para o TSPTW, demonstrando a viabilidade de codificar variantes realistas do problema em dispositivos de quantum annealing.</w:t>
       </w:r>
       <w:r>
         <w:rPr>
@@ -682,25 +502,7 @@
           <w:szCs w:val="20"/>
         </w:rPr>
         <w:tab/>
-        <w:t xml:space="preserve">O objetivo deste trabalho é realizar uma revisão exploratória da literatura sobre a aplicação de algoritmos quânticos, com ênfase em Quantum </w:t>
-      </w:r>
-      <w:proofErr w:type="spellStart"/>
-      <w:r>
-        <w:rPr>
-          <w:rFonts w:ascii="Arial" w:eastAsia="Arial" w:hAnsi="Arial" w:cs="Arial"/>
-          <w:sz w:val="20"/>
-          <w:szCs w:val="20"/>
-        </w:rPr>
-        <w:t>Annealing</w:t>
-      </w:r>
-      <w:proofErr w:type="spellEnd"/>
-      <w:r>
-        <w:rPr>
-          <w:rFonts w:ascii="Arial" w:eastAsia="Arial" w:hAnsi="Arial" w:cs="Arial"/>
-          <w:sz w:val="20"/>
-          <w:szCs w:val="20"/>
-        </w:rPr>
-        <w:t>, ao TSP e suas variantes em logística, identificando o volume de produção acadêmica, os algoritmos mais utilizados e as lacunas de pesquisa existentes.</w:t>
+        <w:t>O objetivo deste trabalho é realizar uma revisão exploratória da literatura sobre a aplicação de algoritmos quânticos, com ênfase em Quantum Annealing, ao TSP e suas variantes em logística, identificando o volume de produção acadêmica, os algoritmos mais utilizados e as lacunas de pesquisa existentes.</w:t>
       </w:r>
     </w:p>
     <w:p>
@@ -754,61 +556,7 @@
           <w:szCs w:val="20"/>
         </w:rPr>
         <w:tab/>
-        <w:t xml:space="preserve">A metodologia adotada consistiu em uma pesquisa bibliográfica exploratória estruturada em três eixos temáticos: (1) o problema — TSP e variantes de otimização combinatória, incluindo VRP, CVRP, </w:t>
-      </w:r>
-      <w:proofErr w:type="spellStart"/>
-      <w:r>
-        <w:rPr>
-          <w:rFonts w:ascii="Arial" w:eastAsia="Arial" w:hAnsi="Arial" w:cs="Arial"/>
-          <w:sz w:val="20"/>
-          <w:szCs w:val="20"/>
-        </w:rPr>
-        <w:t>Job</w:t>
-      </w:r>
-      <w:proofErr w:type="spellEnd"/>
-      <w:r>
-        <w:rPr>
-          <w:rFonts w:ascii="Arial" w:eastAsia="Arial" w:hAnsi="Arial" w:cs="Arial"/>
-          <w:sz w:val="20"/>
-          <w:szCs w:val="20"/>
-        </w:rPr>
-        <w:t xml:space="preserve"> Shop </w:t>
-      </w:r>
-      <w:proofErr w:type="spellStart"/>
-      <w:r>
-        <w:rPr>
-          <w:rFonts w:ascii="Arial" w:eastAsia="Arial" w:hAnsi="Arial" w:cs="Arial"/>
-          <w:sz w:val="20"/>
-          <w:szCs w:val="20"/>
-        </w:rPr>
-        <w:t>Scheduling</w:t>
-      </w:r>
-      <w:proofErr w:type="spellEnd"/>
-      <w:r>
-        <w:rPr>
-          <w:rFonts w:ascii="Arial" w:eastAsia="Arial" w:hAnsi="Arial" w:cs="Arial"/>
-          <w:sz w:val="20"/>
-          <w:szCs w:val="20"/>
-        </w:rPr>
-        <w:t xml:space="preserve"> e Bin </w:t>
-      </w:r>
-      <w:proofErr w:type="spellStart"/>
-      <w:r>
-        <w:rPr>
-          <w:rFonts w:ascii="Arial" w:eastAsia="Arial" w:hAnsi="Arial" w:cs="Arial"/>
-          <w:sz w:val="20"/>
-          <w:szCs w:val="20"/>
-        </w:rPr>
-        <w:t>Packing</w:t>
-      </w:r>
-      <w:proofErr w:type="spellEnd"/>
-      <w:r>
-        <w:rPr>
-          <w:rFonts w:ascii="Arial" w:eastAsia="Arial" w:hAnsi="Arial" w:cs="Arial"/>
-          <w:sz w:val="20"/>
-          <w:szCs w:val="20"/>
-        </w:rPr>
-        <w:t xml:space="preserve">; (2) a tecnologia — paradigmas e algoritmos de computação quântica, como </w:t>
+        <w:t xml:space="preserve">A metodologia adotada consistiu em uma pesquisa bibliográfica exploratória estruturada em três eixos temáticos: (1) o problema — TSP e variantes de otimização combinatória, incluindo VRP, CVRP, Job Shop Scheduling e Bin Packing; (2) a tecnologia — paradigmas e algoritmos de computação quântica, como </w:t>
       </w:r>
       <w:r>
         <w:rPr>
@@ -817,43 +565,7 @@
           <w:szCs w:val="20"/>
         </w:rPr>
         <w:lastRenderedPageBreak/>
-        <w:t xml:space="preserve">Quantum </w:t>
-      </w:r>
-      <w:proofErr w:type="spellStart"/>
-      <w:r>
-        <w:rPr>
-          <w:rFonts w:ascii="Arial" w:eastAsia="Arial" w:hAnsi="Arial" w:cs="Arial"/>
-          <w:sz w:val="20"/>
-          <w:szCs w:val="20"/>
-        </w:rPr>
-        <w:t>Annealing</w:t>
-      </w:r>
-      <w:proofErr w:type="spellEnd"/>
-      <w:r>
-        <w:rPr>
-          <w:rFonts w:ascii="Arial" w:eastAsia="Arial" w:hAnsi="Arial" w:cs="Arial"/>
-          <w:sz w:val="20"/>
-          <w:szCs w:val="20"/>
-        </w:rPr>
-        <w:t>, QAOA, VQE, Grover e formulações QUBO/</w:t>
-      </w:r>
-      <w:proofErr w:type="spellStart"/>
-      <w:r>
-        <w:rPr>
-          <w:rFonts w:ascii="Arial" w:eastAsia="Arial" w:hAnsi="Arial" w:cs="Arial"/>
-          <w:sz w:val="20"/>
-          <w:szCs w:val="20"/>
-        </w:rPr>
-        <w:t>Ising</w:t>
-      </w:r>
-      <w:proofErr w:type="spellEnd"/>
-      <w:r>
-        <w:rPr>
-          <w:rFonts w:ascii="Arial" w:eastAsia="Arial" w:hAnsi="Arial" w:cs="Arial"/>
-          <w:sz w:val="20"/>
-          <w:szCs w:val="20"/>
-        </w:rPr>
-        <w:t>; e (3) a aplicação — logística, gestão da cadeia de suprimentos e otimização de rotas.</w:t>
+        <w:t>Quantum Annealing, QAOA, VQE, Grover e formulações QUBO/Ising; e (3) a aplicação — logística, gestão da cadeia de suprimentos e otimização de rotas.</w:t>
       </w:r>
     </w:p>
     <w:p>
@@ -873,169 +585,7 @@
           <w:szCs w:val="20"/>
         </w:rPr>
         <w:tab/>
-        <w:t xml:space="preserve">Foram construídas 26 </w:t>
-      </w:r>
-      <w:proofErr w:type="spellStart"/>
-      <w:r>
-        <w:rPr>
-          <w:rFonts w:ascii="Arial" w:eastAsia="Arial" w:hAnsi="Arial" w:cs="Arial"/>
-          <w:sz w:val="20"/>
-          <w:szCs w:val="20"/>
-        </w:rPr>
-        <w:t>strings</w:t>
-      </w:r>
-      <w:proofErr w:type="spellEnd"/>
-      <w:r>
-        <w:rPr>
-          <w:rFonts w:ascii="Arial" w:eastAsia="Arial" w:hAnsi="Arial" w:cs="Arial"/>
-          <w:sz w:val="20"/>
-          <w:szCs w:val="20"/>
-        </w:rPr>
-        <w:t xml:space="preserve"> de busca combinando termos dos três eixos com o operador booleano AND, executadas na base Lens.org com filtro para </w:t>
-      </w:r>
-      <w:proofErr w:type="spellStart"/>
-      <w:r>
-        <w:rPr>
-          <w:rFonts w:ascii="Arial" w:eastAsia="Arial" w:hAnsi="Arial" w:cs="Arial"/>
-          <w:sz w:val="20"/>
-          <w:szCs w:val="20"/>
-        </w:rPr>
-        <w:t>Scholarly</w:t>
-      </w:r>
-      <w:proofErr w:type="spellEnd"/>
-      <w:r>
-        <w:rPr>
-          <w:rFonts w:ascii="Arial" w:eastAsia="Arial" w:hAnsi="Arial" w:cs="Arial"/>
-          <w:sz w:val="20"/>
-          <w:szCs w:val="20"/>
-        </w:rPr>
-        <w:t xml:space="preserve"> Works. As </w:t>
-      </w:r>
-      <w:proofErr w:type="spellStart"/>
-      <w:r>
-        <w:rPr>
-          <w:rFonts w:ascii="Arial" w:eastAsia="Arial" w:hAnsi="Arial" w:cs="Arial"/>
-          <w:sz w:val="20"/>
-          <w:szCs w:val="20"/>
-        </w:rPr>
-        <w:t>strings</w:t>
-      </w:r>
-      <w:proofErr w:type="spellEnd"/>
-      <w:r>
-        <w:rPr>
-          <w:rFonts w:ascii="Arial" w:eastAsia="Arial" w:hAnsi="Arial" w:cs="Arial"/>
-          <w:sz w:val="20"/>
-          <w:szCs w:val="20"/>
-        </w:rPr>
-        <w:t xml:space="preserve"> foram classificadas em prioridade Alta (8 </w:t>
-      </w:r>
-      <w:proofErr w:type="spellStart"/>
-      <w:r>
-        <w:rPr>
-          <w:rFonts w:ascii="Arial" w:eastAsia="Arial" w:hAnsi="Arial" w:cs="Arial"/>
-          <w:sz w:val="20"/>
-          <w:szCs w:val="20"/>
-        </w:rPr>
-        <w:t>strings</w:t>
-      </w:r>
-      <w:proofErr w:type="spellEnd"/>
-      <w:r>
-        <w:rPr>
-          <w:rFonts w:ascii="Arial" w:eastAsia="Arial" w:hAnsi="Arial" w:cs="Arial"/>
-          <w:sz w:val="20"/>
-          <w:szCs w:val="20"/>
-        </w:rPr>
-        <w:t xml:space="preserve">), Média (10 </w:t>
-      </w:r>
-      <w:proofErr w:type="spellStart"/>
-      <w:r>
-        <w:rPr>
-          <w:rFonts w:ascii="Arial" w:eastAsia="Arial" w:hAnsi="Arial" w:cs="Arial"/>
-          <w:sz w:val="20"/>
-          <w:szCs w:val="20"/>
-        </w:rPr>
-        <w:t>strings</w:t>
-      </w:r>
-      <w:proofErr w:type="spellEnd"/>
-      <w:r>
-        <w:rPr>
-          <w:rFonts w:ascii="Arial" w:eastAsia="Arial" w:hAnsi="Arial" w:cs="Arial"/>
-          <w:sz w:val="20"/>
-          <w:szCs w:val="20"/>
-        </w:rPr>
-        <w:t xml:space="preserve">) e Baixa (8 </w:t>
-      </w:r>
-      <w:proofErr w:type="spellStart"/>
-      <w:r>
-        <w:rPr>
-          <w:rFonts w:ascii="Arial" w:eastAsia="Arial" w:hAnsi="Arial" w:cs="Arial"/>
-          <w:sz w:val="20"/>
-          <w:szCs w:val="20"/>
-        </w:rPr>
-        <w:t>strings</w:t>
-      </w:r>
-      <w:proofErr w:type="spellEnd"/>
-      <w:r>
-        <w:rPr>
-          <w:rFonts w:ascii="Arial" w:eastAsia="Arial" w:hAnsi="Arial" w:cs="Arial"/>
-          <w:sz w:val="20"/>
-          <w:szCs w:val="20"/>
-        </w:rPr>
-        <w:t xml:space="preserve">), conforme a relevância semântica direta ao tema central. A pesquisa foi conduzida em duas fases: a primeira com 16 </w:t>
-      </w:r>
-      <w:proofErr w:type="spellStart"/>
-      <w:r>
-        <w:rPr>
-          <w:rFonts w:ascii="Arial" w:eastAsia="Arial" w:hAnsi="Arial" w:cs="Arial"/>
-          <w:sz w:val="20"/>
-          <w:szCs w:val="20"/>
-        </w:rPr>
-        <w:t>strings</w:t>
-      </w:r>
-      <w:proofErr w:type="spellEnd"/>
-      <w:r>
-        <w:rPr>
-          <w:rFonts w:ascii="Arial" w:eastAsia="Arial" w:hAnsi="Arial" w:cs="Arial"/>
-          <w:sz w:val="20"/>
-          <w:szCs w:val="20"/>
-        </w:rPr>
-        <w:t xml:space="preserve"> originais baseadas na taxonomia inicial do projeto, e a segunda com 10 </w:t>
-      </w:r>
-      <w:proofErr w:type="spellStart"/>
-      <w:r>
-        <w:rPr>
-          <w:rFonts w:ascii="Arial" w:eastAsia="Arial" w:hAnsi="Arial" w:cs="Arial"/>
-          <w:sz w:val="20"/>
-          <w:szCs w:val="20"/>
-        </w:rPr>
-        <w:t>strings</w:t>
-      </w:r>
-      <w:proofErr w:type="spellEnd"/>
-      <w:r>
-        <w:rPr>
-          <w:rFonts w:ascii="Arial" w:eastAsia="Arial" w:hAnsi="Arial" w:cs="Arial"/>
-          <w:sz w:val="20"/>
-          <w:szCs w:val="20"/>
-        </w:rPr>
-        <w:t xml:space="preserve"> adicionais derivadas da análise do artigo de referência de </w:t>
-      </w:r>
-      <w:proofErr w:type="spellStart"/>
-      <w:r>
-        <w:rPr>
-          <w:rFonts w:ascii="Arial" w:eastAsia="Arial" w:hAnsi="Arial" w:cs="Arial"/>
-          <w:sz w:val="20"/>
-          <w:szCs w:val="20"/>
-        </w:rPr>
-        <w:t>Phillipson</w:t>
-      </w:r>
-      <w:proofErr w:type="spellEnd"/>
-      <w:r>
-        <w:rPr>
-          <w:rFonts w:ascii="Arial" w:eastAsia="Arial" w:hAnsi="Arial" w:cs="Arial"/>
-          <w:sz w:val="20"/>
-          <w:szCs w:val="20"/>
-        </w:rPr>
-        <w:t xml:space="preserve"> (2025).</w:t>
+        <w:t>Foram construídas 26 strings de busca combinando termos dos três eixos com o operador booleano AND, executadas na base Lens.org com filtro para Scholarly Works. As strings foram classificadas em prioridade Alta (8 strings), Média (10 strings) e Baixa (8 strings), conforme a relevância semântica direta ao tema central. A pesquisa foi conduzida em duas fases: a primeira com 16 strings originais baseadas na taxonomia inicial do projeto, e a segunda com 10 strings adicionais derivadas da análise do artigo de referência de Phillipson (2025).</w:t>
       </w:r>
       <w:r>
         <w:rPr>
@@ -1064,43 +614,7 @@
           <w:szCs w:val="20"/>
         </w:rPr>
         <w:tab/>
-        <w:t xml:space="preserve">O processo de </w:t>
-      </w:r>
-      <w:proofErr w:type="spellStart"/>
-      <w:r>
-        <w:rPr>
-          <w:rFonts w:ascii="Arial" w:eastAsia="Arial" w:hAnsi="Arial" w:cs="Arial"/>
-          <w:sz w:val="20"/>
-          <w:szCs w:val="20"/>
-        </w:rPr>
-        <w:t>deduplicação</w:t>
-      </w:r>
-      <w:proofErr w:type="spellEnd"/>
-      <w:r>
-        <w:rPr>
-          <w:rFonts w:ascii="Arial" w:eastAsia="Arial" w:hAnsi="Arial" w:cs="Arial"/>
-          <w:sz w:val="20"/>
-          <w:szCs w:val="20"/>
-        </w:rPr>
-        <w:t xml:space="preserve"> foi realizado em duas etapas: primeiro por DOI (identificador único) e, em seguida, por título normalizado para artigos sem DOI. A análise bibliométrica incluiu distribuição temporal, geográfica, por tipo de acesso e por paradigma quântico, com geração de visualizações estáticas e um painel interativo desenvolvido em </w:t>
-      </w:r>
-      <w:proofErr w:type="spellStart"/>
-      <w:r>
-        <w:rPr>
-          <w:rFonts w:ascii="Arial" w:eastAsia="Arial" w:hAnsi="Arial" w:cs="Arial"/>
-          <w:sz w:val="20"/>
-          <w:szCs w:val="20"/>
-        </w:rPr>
-        <w:t>Streamlit</w:t>
-      </w:r>
-      <w:proofErr w:type="spellEnd"/>
-      <w:r>
-        <w:rPr>
-          <w:rFonts w:ascii="Arial" w:eastAsia="Arial" w:hAnsi="Arial" w:cs="Arial"/>
-          <w:sz w:val="20"/>
-          <w:szCs w:val="20"/>
-        </w:rPr>
-        <w:t>.</w:t>
+        <w:t>O processo de deduplicação foi realizado em duas etapas: primeiro por DOI (identificador único) e, em seguida, por título normalizado para artigos sem DOI. A análise bibliométrica incluiu distribuição temporal, geográfica, por tipo de acesso e por paradigma quântico, com geração de visualizações estáticas e um painel interativo desenvolvido em Streamlit.</w:t>
       </w:r>
     </w:p>
     <w:p>
@@ -1154,43 +668,7 @@
           <w:szCs w:val="20"/>
         </w:rPr>
         <w:tab/>
-        <w:t xml:space="preserve">Do total bruto de 5.320 registros obtidos nas 26 </w:t>
-      </w:r>
-      <w:proofErr w:type="spellStart"/>
-      <w:r>
-        <w:rPr>
-          <w:rFonts w:ascii="Arial" w:eastAsia="Arial" w:hAnsi="Arial" w:cs="Arial"/>
-          <w:sz w:val="20"/>
-          <w:szCs w:val="20"/>
-        </w:rPr>
-        <w:t>strings</w:t>
-      </w:r>
-      <w:proofErr w:type="spellEnd"/>
-      <w:r>
-        <w:rPr>
-          <w:rFonts w:ascii="Arial" w:eastAsia="Arial" w:hAnsi="Arial" w:cs="Arial"/>
-          <w:sz w:val="20"/>
-          <w:szCs w:val="20"/>
-        </w:rPr>
-        <w:t xml:space="preserve"> de busca, a </w:t>
-      </w:r>
-      <w:proofErr w:type="spellStart"/>
-      <w:r>
-        <w:rPr>
-          <w:rFonts w:ascii="Arial" w:eastAsia="Arial" w:hAnsi="Arial" w:cs="Arial"/>
-          <w:sz w:val="20"/>
-          <w:szCs w:val="20"/>
-        </w:rPr>
-        <w:t>deduplicação</w:t>
-      </w:r>
-      <w:proofErr w:type="spellEnd"/>
-      <w:r>
-        <w:rPr>
-          <w:rFonts w:ascii="Arial" w:eastAsia="Arial" w:hAnsi="Arial" w:cs="Arial"/>
-          <w:sz w:val="20"/>
-          <w:szCs w:val="20"/>
-        </w:rPr>
-        <w:t xml:space="preserve"> resultou em 3.696 artigos únicos, com remoção de 1.624 duplicatas (30,5%). A análise revelou um campo em franca expansão: 61,7% dos artigos foram publicados a partir de 2020, com pico em 2025. A produção acadêmica abrange 49 países e 1.409 periódicos e conferências distintos, com 82,8% de acesso aberto, o que favorece a reprodutibilidade da pesquisa.</w:t>
+        <w:t>Do total bruto de 5.320 registros obtidos nas 26 strings de busca, a deduplicação resultou em 3.696 artigos únicos, com remoção de 1.624 duplicatas (30,5%). A análise revelou um campo em franca expansão: 61,7% dos artigos foram publicados a partir de 2020, com pico em 2025. A produção acadêmica abrange 49 países e 1.409 periódicos e conferências distintos, com 82,8% de acesso aberto, o que favorece a reprodutibilidade da pesquisa.</w:t>
       </w:r>
     </w:p>
     <w:p>
@@ -1210,79 +688,7 @@
           <w:szCs w:val="20"/>
         </w:rPr>
         <w:tab/>
-        <w:t xml:space="preserve">O Quantum </w:t>
-      </w:r>
-      <w:proofErr w:type="spellStart"/>
-      <w:r>
-        <w:rPr>
-          <w:rFonts w:ascii="Arial" w:eastAsia="Arial" w:hAnsi="Arial" w:cs="Arial"/>
-          <w:sz w:val="20"/>
-          <w:szCs w:val="20"/>
-        </w:rPr>
-        <w:t>Annealing</w:t>
-      </w:r>
-      <w:proofErr w:type="spellEnd"/>
-      <w:r>
-        <w:rPr>
-          <w:rFonts w:ascii="Arial" w:eastAsia="Arial" w:hAnsi="Arial" w:cs="Arial"/>
-          <w:sz w:val="20"/>
-          <w:szCs w:val="20"/>
-        </w:rPr>
-        <w:t xml:space="preserve"> confirmou-se como o paradigma dominante na literatura, concentrando mais de 1.200 artigos nas </w:t>
-      </w:r>
-      <w:proofErr w:type="spellStart"/>
-      <w:r>
-        <w:rPr>
-          <w:rFonts w:ascii="Arial" w:eastAsia="Arial" w:hAnsi="Arial" w:cs="Arial"/>
-          <w:sz w:val="20"/>
-          <w:szCs w:val="20"/>
-        </w:rPr>
-        <w:t>strings</w:t>
-      </w:r>
-      <w:proofErr w:type="spellEnd"/>
-      <w:r>
-        <w:rPr>
-          <w:rFonts w:ascii="Arial" w:eastAsia="Arial" w:hAnsi="Arial" w:cs="Arial"/>
-          <w:sz w:val="20"/>
-          <w:szCs w:val="20"/>
-        </w:rPr>
-        <w:t xml:space="preserve"> diretamente relacionadas. A plataforma D-</w:t>
-      </w:r>
-      <w:proofErr w:type="spellStart"/>
-      <w:r>
-        <w:rPr>
-          <w:rFonts w:ascii="Arial" w:eastAsia="Arial" w:hAnsi="Arial" w:cs="Arial"/>
-          <w:sz w:val="20"/>
-          <w:szCs w:val="20"/>
-        </w:rPr>
-        <w:t>Wave</w:t>
-      </w:r>
-      <w:proofErr w:type="spellEnd"/>
-      <w:r>
-        <w:rPr>
-          <w:rFonts w:ascii="Arial" w:eastAsia="Arial" w:hAnsi="Arial" w:cs="Arial"/>
-          <w:sz w:val="20"/>
-          <w:szCs w:val="20"/>
-        </w:rPr>
-        <w:t xml:space="preserve">, com o processador Advantage de 5.640 </w:t>
-      </w:r>
-      <w:proofErr w:type="spellStart"/>
-      <w:r>
-        <w:rPr>
-          <w:rFonts w:ascii="Arial" w:eastAsia="Arial" w:hAnsi="Arial" w:cs="Arial"/>
-          <w:sz w:val="20"/>
-          <w:szCs w:val="20"/>
-        </w:rPr>
-        <w:t>qubits</w:t>
-      </w:r>
-      <w:proofErr w:type="spellEnd"/>
-      <w:r>
-        <w:rPr>
-          <w:rFonts w:ascii="Arial" w:eastAsia="Arial" w:hAnsi="Arial" w:cs="Arial"/>
-          <w:sz w:val="20"/>
-          <w:szCs w:val="20"/>
-        </w:rPr>
-        <w:t xml:space="preserve"> e conectividade Pegasus, é o hardware mais utilizado nos estudos experimentais.</w:t>
+        <w:t>O Quantum Annealing confirmou-se como o paradigma dominante na literatura, concentrando mais de 1.200 artigos nas strings diretamente relacionadas. A plataforma D-Wave, com o processador Advantage de 5.640 qubits e conectividade Pegasus, é o hardware mais utilizado nos estudos experimentais.</w:t>
       </w:r>
       <w:r>
         <w:rPr>
@@ -1328,133 +734,7 @@
           <w:szCs w:val="20"/>
         </w:rPr>
         <w:tab/>
-        <w:t xml:space="preserve">A catalogação de mais de 40 algoritmos quânticos permitiu identificar seis categorias principais: Quantum </w:t>
-      </w:r>
-      <w:proofErr w:type="spellStart"/>
-      <w:r>
-        <w:rPr>
-          <w:rFonts w:ascii="Arial" w:eastAsia="Arial" w:hAnsi="Arial" w:cs="Arial"/>
-          <w:sz w:val="20"/>
-          <w:szCs w:val="20"/>
-        </w:rPr>
-        <w:t>Annealing</w:t>
-      </w:r>
-      <w:proofErr w:type="spellEnd"/>
-      <w:r>
-        <w:rPr>
-          <w:rFonts w:ascii="Arial" w:eastAsia="Arial" w:hAnsi="Arial" w:cs="Arial"/>
-          <w:sz w:val="20"/>
-          <w:szCs w:val="20"/>
-        </w:rPr>
-        <w:t xml:space="preserve"> (D-</w:t>
-      </w:r>
-      <w:proofErr w:type="spellStart"/>
-      <w:r>
-        <w:rPr>
-          <w:rFonts w:ascii="Arial" w:eastAsia="Arial" w:hAnsi="Arial" w:cs="Arial"/>
-          <w:sz w:val="20"/>
-          <w:szCs w:val="20"/>
-        </w:rPr>
-        <w:t>Wave</w:t>
-      </w:r>
-      <w:proofErr w:type="spellEnd"/>
-      <w:r>
-        <w:rPr>
-          <w:rFonts w:ascii="Arial" w:eastAsia="Arial" w:hAnsi="Arial" w:cs="Arial"/>
-          <w:sz w:val="20"/>
-          <w:szCs w:val="20"/>
-        </w:rPr>
-        <w:t xml:space="preserve"> QA, </w:t>
-      </w:r>
-      <w:proofErr w:type="spellStart"/>
-      <w:r>
-        <w:rPr>
-          <w:rFonts w:ascii="Arial" w:eastAsia="Arial" w:hAnsi="Arial" w:cs="Arial"/>
-          <w:sz w:val="20"/>
-          <w:szCs w:val="20"/>
-        </w:rPr>
-        <w:t>Hybrid</w:t>
-      </w:r>
-      <w:proofErr w:type="spellEnd"/>
-      <w:r>
-        <w:rPr>
-          <w:rFonts w:ascii="Arial" w:eastAsia="Arial" w:hAnsi="Arial" w:cs="Arial"/>
-          <w:sz w:val="20"/>
-          <w:szCs w:val="20"/>
-        </w:rPr>
-        <w:t xml:space="preserve"> Solver, Reverse </w:t>
-      </w:r>
-      <w:proofErr w:type="spellStart"/>
-      <w:r>
-        <w:rPr>
-          <w:rFonts w:ascii="Arial" w:eastAsia="Arial" w:hAnsi="Arial" w:cs="Arial"/>
-          <w:sz w:val="20"/>
-          <w:szCs w:val="20"/>
-        </w:rPr>
-        <w:t>Annealing</w:t>
-      </w:r>
-      <w:proofErr w:type="spellEnd"/>
-      <w:r>
-        <w:rPr>
-          <w:rFonts w:ascii="Arial" w:eastAsia="Arial" w:hAnsi="Arial" w:cs="Arial"/>
-          <w:sz w:val="20"/>
-          <w:szCs w:val="20"/>
-        </w:rPr>
-        <w:t>), algoritmos variacionais (QAOA, VQE, F-VQE), algoritmos exatos (Grover, QPE), abordagens híbridas (decomposição + QA, path-</w:t>
-      </w:r>
-      <w:proofErr w:type="spellStart"/>
-      <w:r>
-        <w:rPr>
-          <w:rFonts w:ascii="Arial" w:eastAsia="Arial" w:hAnsi="Arial" w:cs="Arial"/>
-          <w:sz w:val="20"/>
-          <w:szCs w:val="20"/>
-        </w:rPr>
-        <w:t>slicing</w:t>
-      </w:r>
-      <w:proofErr w:type="spellEnd"/>
-      <w:r>
-        <w:rPr>
-          <w:rFonts w:ascii="Arial" w:eastAsia="Arial" w:hAnsi="Arial" w:cs="Arial"/>
-          <w:sz w:val="20"/>
-          <w:szCs w:val="20"/>
-        </w:rPr>
-        <w:t>), aprendizado de máquina quântico (QRL, QACO) e algoritmos quantum-</w:t>
-      </w:r>
-      <w:proofErr w:type="spellStart"/>
-      <w:r>
-        <w:rPr>
-          <w:rFonts w:ascii="Arial" w:eastAsia="Arial" w:hAnsi="Arial" w:cs="Arial"/>
-          <w:sz w:val="20"/>
-          <w:szCs w:val="20"/>
-        </w:rPr>
-        <w:t>inspired</w:t>
-      </w:r>
-      <w:proofErr w:type="spellEnd"/>
-      <w:r>
-        <w:rPr>
-          <w:rFonts w:ascii="Arial" w:eastAsia="Arial" w:hAnsi="Arial" w:cs="Arial"/>
-          <w:sz w:val="20"/>
-          <w:szCs w:val="20"/>
-        </w:rPr>
-        <w:t xml:space="preserve">. Destaca-se que a maioria das implementações reportadas utiliza abordagens híbridas, combinando processamento quântico com </w:t>
-      </w:r>
-      <w:proofErr w:type="spellStart"/>
-      <w:r>
-        <w:rPr>
-          <w:rFonts w:ascii="Arial" w:eastAsia="Arial" w:hAnsi="Arial" w:cs="Arial"/>
-          <w:sz w:val="20"/>
-          <w:szCs w:val="20"/>
-        </w:rPr>
-        <w:t>solvers</w:t>
-      </w:r>
-      <w:proofErr w:type="spellEnd"/>
-      <w:r>
-        <w:rPr>
-          <w:rFonts w:ascii="Arial" w:eastAsia="Arial" w:hAnsi="Arial" w:cs="Arial"/>
-          <w:sz w:val="20"/>
-          <w:szCs w:val="20"/>
-        </w:rPr>
-        <w:t xml:space="preserve"> clássicos.</w:t>
+        <w:t>A catalogação de mais de 40 algoritmos quânticos permitiu identificar seis categorias principais: Quantum Annealing (D-Wave QA, Hybrid Solver, Reverse Annealing), algoritmos variacionais (QAOA, VQE, F-VQE), algoritmos exatos (Grover, QPE), abordagens híbridas (decomposição + QA, path-slicing), aprendizado de máquina quântico (QRL, QACO) e algoritmos quantum-inspired. Destaca-se que a maioria das implementações reportadas utiliza abordagens híbridas, combinando processamento quântico com solvers clássicos.</w:t>
       </w:r>
       <w:r>
         <w:rPr>
@@ -1483,60 +763,7 @@
           <w:szCs w:val="20"/>
         </w:rPr>
         <w:tab/>
-      </w:r>
-      <w:proofErr w:type="spellStart"/>
-      <w:r>
-        <w:rPr>
-          <w:rFonts w:ascii="Arial" w:eastAsia="Arial" w:hAnsi="Arial" w:cs="Arial"/>
-          <w:sz w:val="20"/>
-          <w:szCs w:val="20"/>
-        </w:rPr>
-        <w:t>Salehi</w:t>
-      </w:r>
-      <w:proofErr w:type="spellEnd"/>
-      <w:r>
-        <w:rPr>
-          <w:rFonts w:ascii="Arial" w:eastAsia="Arial" w:hAnsi="Arial" w:cs="Arial"/>
-          <w:sz w:val="20"/>
-          <w:szCs w:val="20"/>
-        </w:rPr>
-        <w:t xml:space="preserve">, Glos e </w:t>
-      </w:r>
-      <w:proofErr w:type="spellStart"/>
-      <w:r>
-        <w:rPr>
-          <w:rFonts w:ascii="Arial" w:eastAsia="Arial" w:hAnsi="Arial" w:cs="Arial"/>
-          <w:sz w:val="20"/>
-          <w:szCs w:val="20"/>
-        </w:rPr>
-        <w:t>Miszczak</w:t>
-      </w:r>
-      <w:proofErr w:type="spellEnd"/>
-      <w:r>
-        <w:rPr>
-          <w:rFonts w:ascii="Arial" w:eastAsia="Arial" w:hAnsi="Arial" w:cs="Arial"/>
-          <w:sz w:val="20"/>
-          <w:szCs w:val="20"/>
-        </w:rPr>
-        <w:t xml:space="preserve"> (2022) propuseram três formulações QUBO distintas para o TSPTW — baseadas em nós e arestas —, demonstrando experimentalmente sua viabilidade em dispositivo D-</w:t>
-      </w:r>
-      <w:proofErr w:type="spellStart"/>
-      <w:r>
-        <w:rPr>
-          <w:rFonts w:ascii="Arial" w:eastAsia="Arial" w:hAnsi="Arial" w:cs="Arial"/>
-          <w:sz w:val="20"/>
-          <w:szCs w:val="20"/>
-        </w:rPr>
-        <w:t>Wave</w:t>
-      </w:r>
-      <w:proofErr w:type="spellEnd"/>
-      <w:r>
-        <w:rPr>
-          <w:rFonts w:ascii="Arial" w:eastAsia="Arial" w:hAnsi="Arial" w:cs="Arial"/>
-          <w:sz w:val="20"/>
-          <w:szCs w:val="20"/>
-        </w:rPr>
-        <w:t xml:space="preserve"> para instâncias de 4 cidades. O trabalho evidenciou que formulações baseadas em arestas oferecem vantagens em termos de número de variáveis, enquanto formulações baseadas em nós permitem codificação mais intuitiva das restrições temporais.</w:t>
+        <w:t>Salehi, Glos e Miszczak (2022) propuseram três formulações QUBO distintas para o TSPTW — baseadas em nós e arestas —, demonstrando experimentalmente sua viabilidade em dispositivo D-Wave para instâncias de 4 cidades. O trabalho evidenciou que formulações baseadas em arestas oferecem vantagens em termos de número de variáveis, enquanto formulações baseadas em nós permitem codificação mais intuitiva das restrições temporais.</w:t>
       </w:r>
       <w:r>
         <w:rPr>
@@ -1565,43 +792,7 @@
           <w:szCs w:val="20"/>
         </w:rPr>
         <w:tab/>
-        <w:t xml:space="preserve">As principais lacunas identificadas incluem: escassez de soluções gate-based escaláveis para TSP; apenas 21 artigos sobre Quantum </w:t>
-      </w:r>
-      <w:proofErr w:type="spellStart"/>
-      <w:r>
-        <w:rPr>
-          <w:rFonts w:ascii="Arial" w:eastAsia="Arial" w:hAnsi="Arial" w:cs="Arial"/>
-          <w:sz w:val="20"/>
-          <w:szCs w:val="20"/>
-        </w:rPr>
-        <w:t>Reinforcement</w:t>
-      </w:r>
-      <w:proofErr w:type="spellEnd"/>
-      <w:r>
-        <w:rPr>
-          <w:rFonts w:ascii="Arial" w:eastAsia="Arial" w:hAnsi="Arial" w:cs="Arial"/>
-          <w:sz w:val="20"/>
-          <w:szCs w:val="20"/>
-        </w:rPr>
-        <w:t xml:space="preserve"> Learning para roteamento; somente 18 artigos sobre CVRP com Quantum </w:t>
-      </w:r>
-      <w:proofErr w:type="spellStart"/>
-      <w:r>
-        <w:rPr>
-          <w:rFonts w:ascii="Arial" w:eastAsia="Arial" w:hAnsi="Arial" w:cs="Arial"/>
-          <w:sz w:val="20"/>
-          <w:szCs w:val="20"/>
-        </w:rPr>
-        <w:t>Annealing</w:t>
-      </w:r>
-      <w:proofErr w:type="spellEnd"/>
-      <w:r>
-        <w:rPr>
-          <w:rFonts w:ascii="Arial" w:eastAsia="Arial" w:hAnsi="Arial" w:cs="Arial"/>
-          <w:sz w:val="20"/>
-          <w:szCs w:val="20"/>
-        </w:rPr>
-        <w:t>; e limitada validação com dados logísticos reais, predominando benchmarks acadêmicos.</w:t>
+        <w:t>As principais lacunas identificadas incluem: escassez de soluções gate-based escaláveis para TSP; apenas 21 artigos sobre Quantum Reinforcement Learning para roteamento; somente 18 artigos sobre CVRP com Quantum Annealing; e limitada validação com dados logísticos reais, predominando benchmarks acadêmicos.</w:t>
       </w:r>
     </w:p>
     <w:p>
@@ -1667,25 +858,7 @@
           <w:szCs w:val="20"/>
         </w:rPr>
         <w:tab/>
-        <w:t xml:space="preserve">A revisão exploratória realizada demonstrou que a aplicação de computação quântica ao TSP é um campo em rápida expansão, sustentado por uma base bibliográfica robusta de 3.696 artigos únicos. O Quantum </w:t>
-      </w:r>
-      <w:proofErr w:type="spellStart"/>
-      <w:r>
-        <w:rPr>
-          <w:rFonts w:ascii="Arial" w:eastAsia="Arial" w:hAnsi="Arial" w:cs="Arial"/>
-          <w:sz w:val="20"/>
-          <w:szCs w:val="20"/>
-        </w:rPr>
-        <w:t>Annealing</w:t>
-      </w:r>
-      <w:proofErr w:type="spellEnd"/>
-      <w:r>
-        <w:rPr>
-          <w:rFonts w:ascii="Arial" w:eastAsia="Arial" w:hAnsi="Arial" w:cs="Arial"/>
-          <w:sz w:val="20"/>
-          <w:szCs w:val="20"/>
-        </w:rPr>
-        <w:t xml:space="preserve"> consolidou-se como o paradigma mais maduro e acessível para otimização combinatória, enquanto algoritmos variacionais e de aprendizado de máquina quântico representam fronteiras de pesquisa ainda pouco exploradas.</w:t>
+        <w:t>A revisão exploratória realizada demonstrou que a aplicação de computação quântica ao TSP é um campo em rápida expansão, sustentado por uma base bibliográfica robusta de 3.696 artigos únicos. O Quantum Annealing consolidou-se como o paradigma mais maduro e acessível para otimização combinatória, enquanto algoritmos variacionais e de aprendizado de máquina quântico representam fronteiras de pesquisa ainda pouco exploradas.</w:t>
       </w:r>
     </w:p>
     <w:p>
@@ -1830,27 +1003,7 @@
           <w:szCs w:val="20"/>
           <w:lang w:val="en-US"/>
         </w:rPr>
-        <w:t xml:space="preserve">KADOWAKI, T.; NISHIMORI, H. Quantum annealing in the </w:t>
-      </w:r>
-      <w:proofErr w:type="gramStart"/>
-      <w:r>
-        <w:rPr>
-          <w:rFonts w:ascii="Arial" w:eastAsia="Arial" w:hAnsi="Arial" w:cs="Arial"/>
-          <w:sz w:val="20"/>
-          <w:szCs w:val="20"/>
-          <w:lang w:val="en-US"/>
-        </w:rPr>
-        <w:t>transverse</w:t>
-      </w:r>
-      <w:proofErr w:type="gramEnd"/>
-      <w:r>
-        <w:rPr>
-          <w:rFonts w:ascii="Arial" w:eastAsia="Arial" w:hAnsi="Arial" w:cs="Arial"/>
-          <w:sz w:val="20"/>
-          <w:szCs w:val="20"/>
-          <w:lang w:val="en-US"/>
-        </w:rPr>
-        <w:t xml:space="preserve"> Ising model. </w:t>
+        <w:t xml:space="preserve">KADOWAKI, T.; NISHIMORI, H. Quantum annealing in the transverse Ising model. </w:t>
       </w:r>
       <w:r>
         <w:rPr>
@@ -2005,29 +1158,16 @@
         </w:rPr>
         <w:t xml:space="preserve">FARHI, E.; GOLDSTONE, J.; GUTMANN, S. A quantum approximate optimization algorithm. </w:t>
       </w:r>
-      <w:proofErr w:type="spellStart"/>
-      <w:r>
-        <w:rPr>
-          <w:rFonts w:ascii="Arial" w:eastAsia="Arial" w:hAnsi="Arial" w:cs="Arial"/>
-          <w:b/>
-          <w:bCs/>
-          <w:sz w:val="20"/>
-          <w:szCs w:val="20"/>
-          <w:lang w:val="en-US"/>
-        </w:rPr>
-        <w:t>arXiv</w:t>
-      </w:r>
-      <w:proofErr w:type="spellEnd"/>
-      <w:r>
-        <w:rPr>
-          <w:rFonts w:ascii="Arial" w:eastAsia="Arial" w:hAnsi="Arial" w:cs="Arial"/>
-          <w:b/>
-          <w:bCs/>
-          <w:sz w:val="20"/>
-          <w:szCs w:val="20"/>
-          <w:lang w:val="en-US"/>
-        </w:rPr>
-        <w:t xml:space="preserve"> preprint</w:t>
+      <w:r>
+        <w:rPr>
+          <w:rFonts w:ascii="Arial" w:eastAsia="Arial" w:hAnsi="Arial" w:cs="Arial"/>
+          <w:b/>
+          <w:bCs/>
+          <w:sz w:val="20"/>
+          <w:szCs w:val="20"/>
+          <w:lang w:val="en-US"/>
+        </w:rPr>
+        <w:t>arXiv preprint</w:t>
       </w:r>
       <w:r>
         <w:rPr>

</xml_diff>